<commit_message>
SCD project source files
</commit_message>
<xml_diff>
--- a/sem5/scd/project/detailed-documnent.docx
+++ b/sem5/scd/project/detailed-documnent.docx
@@ -875,7 +875,55 @@
           <w:sz w:val="22"/>
           <w:szCs w:val="22"/>
         </w:rPr>
-        <w:t>This system improves communication, reduces workload, and ensures that appointments are handled smoothly and accurately. By using proper software engineering techniques—such as UML diagrams, structured design</w:t>
+        <w:drawing>
+          <wp:anchor distT="0" distB="0" distL="114300" distR="114300" simplePos="0" relativeHeight="251659264" behindDoc="0" locked="0" layoutInCell="1" allowOverlap="1" wp14:anchorId="6F5BC1EC" wp14:editId="52063151">
+            <wp:simplePos x="0" y="0"/>
+            <wp:positionH relativeFrom="margin">
+              <wp:align>left</wp:align>
+            </wp:positionH>
+            <wp:positionV relativeFrom="paragraph">
+              <wp:posOffset>683895</wp:posOffset>
+            </wp:positionV>
+            <wp:extent cx="5731510" cy="2975610"/>
+            <wp:effectExtent l="0" t="0" r="2540" b="0"/>
+            <wp:wrapTopAndBottom/>
+            <wp:docPr id="1000037876" name="Picture 1"/>
+            <wp:cNvGraphicFramePr>
+              <a:graphicFrameLocks xmlns:a="http://schemas.openxmlformats.org/drawingml/2006/main" noChangeAspect="1"/>
+            </wp:cNvGraphicFramePr>
+            <a:graphic xmlns:a="http://schemas.openxmlformats.org/drawingml/2006/main">
+              <a:graphicData uri="http://schemas.openxmlformats.org/drawingml/2006/picture">
+                <pic:pic xmlns:pic="http://schemas.openxmlformats.org/drawingml/2006/picture">
+                  <pic:nvPicPr>
+                    <pic:cNvPr id="1000037876" name=""/>
+                    <pic:cNvPicPr/>
+                  </pic:nvPicPr>
+                  <pic:blipFill>
+                    <a:blip r:embed="rId6" cstate="print">
+                      <a:extLst>
+                        <a:ext uri="{28A0092B-C50C-407E-A947-70E740481C1C}">
+                          <a14:useLocalDpi xmlns:a14="http://schemas.microsoft.com/office/drawing/2010/main" val="0"/>
+                        </a:ext>
+                      </a:extLst>
+                    </a:blip>
+                    <a:stretch>
+                      <a:fillRect/>
+                    </a:stretch>
+                  </pic:blipFill>
+                  <pic:spPr>
+                    <a:xfrm>
+                      <a:off x="0" y="0"/>
+                      <a:ext cx="5731510" cy="2975610"/>
+                    </a:xfrm>
+                    <a:prstGeom prst="rect">
+                      <a:avLst/>
+                    </a:prstGeom>
+                  </pic:spPr>
+                </pic:pic>
+              </a:graphicData>
+            </a:graphic>
+          </wp:anchor>
+        </w:drawing>
       </w:r>
       <w:r>
         <w:rPr>
@@ -883,7 +931,21 @@
           <w:sz w:val="22"/>
           <w:szCs w:val="22"/>
         </w:rPr>
+        <w:t>This system improves communication, reduces workload, and ensures that appointments are handled smoothly and accurately. By using proper software engineering techniques—such as UML diagrams, structured design</w:t>
+      </w:r>
+      <w:r>
+        <w:rPr>
+          <w:rFonts w:ascii="Calibri" w:hAnsi="Calibri" w:cs="Calibri"/>
+          <w:sz w:val="22"/>
+          <w:szCs w:val="22"/>
+        </w:rPr>
         <w:t>.</w:t>
+      </w:r>
+      <w:r>
+        <w:rPr>
+          <w:noProof/>
+        </w:rPr>
+        <w:t xml:space="preserve"> </w:t>
       </w:r>
     </w:p>
     <w:p>
@@ -941,7 +1003,7 @@
                     <pic:cNvPicPr/>
                   </pic:nvPicPr>
                   <pic:blipFill>
-                    <a:blip r:embed="rId6">
+                    <a:blip r:embed="rId7">
                       <a:extLst>
                         <a:ext uri="{28A0092B-C50C-407E-A947-70E740481C1C}">
                           <a14:useLocalDpi xmlns:a14="http://schemas.microsoft.com/office/drawing/2010/main" val="0"/>

</xml_diff>

<commit_message>
cn assignemnt 2 and 3
</commit_message>
<xml_diff>
--- a/sem5/scd/project/detailed-documnent.docx
+++ b/sem5/scd/project/detailed-documnent.docx
@@ -36,7 +36,7 @@
                     </pic:cNvPicPr>
                   </pic:nvPicPr>
                   <pic:blipFill>
-                    <a:blip r:embed="rId5">
+                    <a:blip r:embed="rId6">
                       <a:extLst>
                         <a:ext uri="{28A0092B-C50C-407E-A947-70E740481C1C}">
                           <a14:useLocalDpi xmlns:a14="http://schemas.microsoft.com/office/drawing/2010/main" val="0"/>
@@ -134,19 +134,20 @@
           <w:szCs w:val="36"/>
           <w:u w:val="single"/>
         </w:rPr>
-        <w:t xml:space="preserve"> Development </w:t>
-      </w:r>
-      <w:r>
-        <w:rPr>
-          <w:rFonts w:ascii="Calibri" w:hAnsi="Calibri" w:cs="Calibri"/>
-          <w:b/>
-          <w:bCs/>
-          <w:sz w:val="36"/>
-          <w:szCs w:val="36"/>
+        <w:t xml:space="preserve"> Development Final Project</w:t>
+      </w:r>
+    </w:p>
+    <w:p>
+      <w:pPr>
+        <w:rPr>
+          <w:rFonts w:ascii="Calibri" w:hAnsi="Calibri" w:cs="Calibri"/>
+          <w:b/>
+          <w:bCs/>
+          <w:sz w:val="28"/>
+          <w:szCs w:val="28"/>
           <w:u w:val="single"/>
         </w:rPr>
-        <w:t>Final Project</w:t>
-      </w:r>
+      </w:pPr>
     </w:p>
     <w:p>
       <w:pPr>
@@ -168,18 +169,6 @@
           <w:bCs/>
           <w:sz w:val="28"/>
           <w:szCs w:val="28"/>
-          <w:u w:val="single"/>
-        </w:rPr>
-      </w:pPr>
-    </w:p>
-    <w:p>
-      <w:pPr>
-        <w:rPr>
-          <w:rFonts w:ascii="Calibri" w:hAnsi="Calibri" w:cs="Calibri"/>
-          <w:b/>
-          <w:bCs/>
-          <w:sz w:val="28"/>
-          <w:szCs w:val="28"/>
         </w:rPr>
       </w:pPr>
       <w:r>
@@ -212,47 +201,7 @@
           <w:szCs w:val="28"/>
         </w:rPr>
         <w:tab/>
-        <w:t xml:space="preserve">   </w:t>
-      </w:r>
-      <w:r>
-        <w:rPr>
-          <w:rFonts w:ascii="Calibri" w:hAnsi="Calibri" w:cs="Calibri"/>
-          <w:b/>
-          <w:bCs/>
-          <w:sz w:val="28"/>
-          <w:szCs w:val="28"/>
-        </w:rPr>
-        <w:t>Zohaib Ijaz</w:t>
-      </w:r>
-      <w:r>
-        <w:rPr>
-          <w:rFonts w:ascii="Calibri" w:hAnsi="Calibri" w:cs="Calibri"/>
-          <w:b/>
-          <w:bCs/>
-          <w:sz w:val="28"/>
-          <w:szCs w:val="28"/>
-        </w:rPr>
-        <w:t xml:space="preserve"> (FL238</w:t>
-      </w:r>
-      <w:r>
-        <w:rPr>
-          <w:rFonts w:ascii="Calibri" w:hAnsi="Calibri" w:cs="Calibri"/>
-          <w:b/>
-          <w:bCs/>
-          <w:sz w:val="28"/>
-          <w:szCs w:val="28"/>
-        </w:rPr>
-        <w:t>11</w:t>
-      </w:r>
-      <w:r>
-        <w:rPr>
-          <w:rFonts w:ascii="Calibri" w:hAnsi="Calibri" w:cs="Calibri"/>
-          <w:b/>
-          <w:bCs/>
-          <w:sz w:val="28"/>
-          <w:szCs w:val="28"/>
-        </w:rPr>
-        <w:t>)</w:t>
+        <w:t xml:space="preserve">   Zohaib Ijaz (FL23811)</w:t>
       </w:r>
     </w:p>
     <w:p>
@@ -274,47 +223,7 @@
           <w:szCs w:val="28"/>
         </w:rPr>
         <w:tab/>
-        <w:t xml:space="preserve">   </w:t>
-      </w:r>
-      <w:r>
-        <w:rPr>
-          <w:rFonts w:ascii="Calibri" w:hAnsi="Calibri" w:cs="Calibri"/>
-          <w:b/>
-          <w:bCs/>
-          <w:sz w:val="28"/>
-          <w:szCs w:val="28"/>
-        </w:rPr>
-        <w:t xml:space="preserve">Nazish Khan </w:t>
-      </w:r>
-      <w:r>
-        <w:rPr>
-          <w:rFonts w:ascii="Calibri" w:hAnsi="Calibri" w:cs="Calibri"/>
-          <w:b/>
-          <w:bCs/>
-          <w:sz w:val="28"/>
-          <w:szCs w:val="28"/>
-        </w:rPr>
-        <w:t>(</w:t>
-      </w:r>
-      <w:r>
-        <w:rPr>
-          <w:rFonts w:ascii="Calibri" w:hAnsi="Calibri" w:cs="Calibri"/>
-          <w:b/>
-          <w:bCs/>
-          <w:sz w:val="28"/>
-          <w:szCs w:val="28"/>
-        </w:rPr>
-        <w:t>FL23843</w:t>
-      </w:r>
-      <w:r>
-        <w:rPr>
-          <w:rFonts w:ascii="Calibri" w:hAnsi="Calibri" w:cs="Calibri"/>
-          <w:b/>
-          <w:bCs/>
-          <w:sz w:val="28"/>
-          <w:szCs w:val="28"/>
-        </w:rPr>
-        <w:t>)</w:t>
+        <w:t xml:space="preserve">   Nazish Khan (FL23843)</w:t>
       </w:r>
     </w:p>
     <w:p>
@@ -336,47 +245,7 @@
           <w:szCs w:val="28"/>
         </w:rPr>
         <w:tab/>
-        <w:t xml:space="preserve">   </w:t>
-      </w:r>
-      <w:r>
-        <w:rPr>
-          <w:rFonts w:ascii="Calibri" w:hAnsi="Calibri" w:cs="Calibri"/>
-          <w:b/>
-          <w:bCs/>
-          <w:sz w:val="28"/>
-          <w:szCs w:val="28"/>
-        </w:rPr>
-        <w:t xml:space="preserve">Zainab Fatima </w:t>
-      </w:r>
-      <w:r>
-        <w:rPr>
-          <w:rFonts w:ascii="Calibri" w:hAnsi="Calibri" w:cs="Calibri"/>
-          <w:b/>
-          <w:bCs/>
-          <w:sz w:val="28"/>
-          <w:szCs w:val="28"/>
-        </w:rPr>
-        <w:t>(SP236</w:t>
-      </w:r>
-      <w:r>
-        <w:rPr>
-          <w:rFonts w:ascii="Calibri" w:hAnsi="Calibri" w:cs="Calibri"/>
-          <w:b/>
-          <w:bCs/>
-          <w:sz w:val="28"/>
-          <w:szCs w:val="28"/>
-        </w:rPr>
-        <w:t>90</w:t>
-      </w:r>
-      <w:r>
-        <w:rPr>
-          <w:rFonts w:ascii="Calibri" w:hAnsi="Calibri" w:cs="Calibri"/>
-          <w:b/>
-          <w:bCs/>
-          <w:sz w:val="28"/>
-          <w:szCs w:val="28"/>
-        </w:rPr>
-        <w:t>)</w:t>
+        <w:t xml:space="preserve">   Zainab Fatima (SP23690)</w:t>
       </w:r>
     </w:p>
     <w:p>
@@ -872,6 +741,7 @@
       <w:r>
         <w:rPr>
           <w:rFonts w:ascii="Calibri" w:hAnsi="Calibri" w:cs="Calibri"/>
+          <w:noProof/>
           <w:sz w:val="22"/>
           <w:szCs w:val="22"/>
         </w:rPr>
@@ -899,7 +769,7 @@
                     <pic:cNvPicPr/>
                   </pic:nvPicPr>
                   <pic:blipFill>
-                    <a:blip r:embed="rId6" cstate="print">
+                    <a:blip r:embed="rId7" cstate="print">
                       <a:extLst>
                         <a:ext uri="{28A0092B-C50C-407E-A947-70E740481C1C}">
                           <a14:useLocalDpi xmlns:a14="http://schemas.microsoft.com/office/drawing/2010/main" val="0"/>
@@ -931,18 +801,11 @@
           <w:sz w:val="22"/>
           <w:szCs w:val="22"/>
         </w:rPr>
-        <w:t>This system improves communication, reduces workload, and ensures that appointments are handled smoothly and accurately. By using proper software engineering techniques—such as UML diagrams, structured design</w:t>
-      </w:r>
-      <w:r>
-        <w:rPr>
-          <w:rFonts w:ascii="Calibri" w:hAnsi="Calibri" w:cs="Calibri"/>
-          <w:sz w:val="22"/>
-          <w:szCs w:val="22"/>
-        </w:rPr>
-        <w:t>.</w:t>
-      </w:r>
-      <w:r>
-        <w:rPr>
+        <w:t>This system improves communication, reduces workload, and ensures that appointments are handled smoothly and accurately. By using proper software engineering techniques—such as UML diagrams, structured design.</w:t>
+      </w:r>
+      <w:r>
+        <w:rPr>
+          <w:rFonts w:ascii="Calibri" w:hAnsi="Calibri" w:cs="Calibri"/>
           <w:noProof/>
         </w:rPr>
         <w:t xml:space="preserve"> </w:t>
@@ -953,15 +816,11 @@
         <w:pStyle w:val="Heading2"/>
         <w:rPr>
           <w:rFonts w:ascii="Calibri" w:hAnsi="Calibri" w:cs="Calibri"/>
-          <w:b/>
-          <w:bCs/>
-        </w:rPr>
-      </w:pPr>
-      <w:r>
-        <w:rPr>
-          <w:rFonts w:ascii="Calibri" w:hAnsi="Calibri" w:cs="Calibri"/>
-          <w:b/>
-          <w:bCs/>
+        </w:rPr>
+      </w:pPr>
+      <w:r>
+        <w:rPr>
+          <w:rFonts w:ascii="Calibri" w:hAnsi="Calibri" w:cs="Calibri"/>
         </w:rPr>
         <w:lastRenderedPageBreak/>
         <w:t>3. Detailed Design</w:t>
@@ -969,29 +828,193 @@
     </w:p>
     <w:p>
       <w:pPr>
-        <w:pStyle w:val="Heading3"/>
+        <w:rPr>
+          <w:rFonts w:ascii="Calibri" w:hAnsi="Calibri" w:cs="Calibri"/>
+          <w:sz w:val="22"/>
+          <w:szCs w:val="22"/>
+        </w:rPr>
+      </w:pPr>
+      <w:r>
+        <w:rPr>
+          <w:rFonts w:ascii="Calibri" w:hAnsi="Calibri" w:cs="Calibri"/>
+          <w:sz w:val="22"/>
+          <w:szCs w:val="22"/>
+        </w:rPr>
+        <w:t xml:space="preserve">This section explains the detailed design of the </w:t>
+      </w:r>
+      <w:r>
+        <w:rPr>
+          <w:rFonts w:ascii="Calibri" w:hAnsi="Calibri" w:cs="Calibri"/>
+          <w:i/>
+          <w:iCs/>
+          <w:sz w:val="22"/>
+          <w:szCs w:val="22"/>
+        </w:rPr>
+        <w:t>Hospital Appointment Booking System</w:t>
+      </w:r>
+      <w:r>
+        <w:rPr>
+          <w:rFonts w:ascii="Calibri" w:hAnsi="Calibri" w:cs="Calibri"/>
+          <w:sz w:val="22"/>
+          <w:szCs w:val="22"/>
+        </w:rPr>
+        <w:t xml:space="preserve"> using UML diagrams. These diagrams help visualize the structure of the system, the relationships between objects, and the interaction flow during different operations. Each diagram provides a different perspective of the system’s internal behavior and supports a clear and organized implementation.</w:t>
+      </w:r>
+    </w:p>
+    <w:p>
+      <w:pPr>
+        <w:rPr>
+          <w:rFonts w:ascii="Calibri" w:hAnsi="Calibri" w:cs="Calibri"/>
+          <w:sz w:val="22"/>
+          <w:szCs w:val="22"/>
+        </w:rPr>
+      </w:pPr>
+      <w:r>
+        <w:rPr>
+          <w:rFonts w:ascii="Calibri" w:hAnsi="Calibri" w:cs="Calibri"/>
+          <w:sz w:val="22"/>
+          <w:szCs w:val="22"/>
+        </w:rPr>
+        <w:t>The following subsections include:</w:t>
+      </w:r>
+    </w:p>
+    <w:p>
+      <w:pPr>
         <w:numPr>
           <w:ilvl w:val="0"/>
-          <w:numId w:val="3"/>
+          <w:numId w:val="4"/>
         </w:numPr>
-      </w:pPr>
-      <w:r>
-        <w:rPr>
+        <w:rPr>
+          <w:rFonts w:ascii="Calibri" w:hAnsi="Calibri" w:cs="Calibri"/>
+          <w:sz w:val="22"/>
+          <w:szCs w:val="22"/>
+        </w:rPr>
+      </w:pPr>
+      <w:r>
+        <w:rPr>
+          <w:rFonts w:ascii="Calibri" w:hAnsi="Calibri" w:cs="Calibri"/>
+          <w:sz w:val="22"/>
+          <w:szCs w:val="22"/>
+        </w:rPr>
+        <w:t>Use-Case Diagram</w:t>
+      </w:r>
+    </w:p>
+    <w:p>
+      <w:pPr>
+        <w:numPr>
+          <w:ilvl w:val="0"/>
+          <w:numId w:val="4"/>
+        </w:numPr>
+        <w:rPr>
+          <w:rFonts w:ascii="Calibri" w:hAnsi="Calibri" w:cs="Calibri"/>
+          <w:sz w:val="22"/>
+          <w:szCs w:val="22"/>
+        </w:rPr>
+      </w:pPr>
+      <w:r>
+        <w:rPr>
+          <w:rFonts w:ascii="Calibri" w:hAnsi="Calibri" w:cs="Calibri"/>
+          <w:sz w:val="22"/>
+          <w:szCs w:val="22"/>
+        </w:rPr>
+        <w:t>Object Diagram</w:t>
+      </w:r>
+    </w:p>
+    <w:p>
+      <w:pPr>
+        <w:numPr>
+          <w:ilvl w:val="0"/>
+          <w:numId w:val="4"/>
+        </w:numPr>
+        <w:rPr>
+          <w:rFonts w:ascii="Calibri" w:hAnsi="Calibri" w:cs="Calibri"/>
+          <w:sz w:val="22"/>
+          <w:szCs w:val="22"/>
+        </w:rPr>
+      </w:pPr>
+      <w:r>
+        <w:rPr>
+          <w:rFonts w:ascii="Calibri" w:hAnsi="Calibri" w:cs="Calibri"/>
+          <w:sz w:val="22"/>
+          <w:szCs w:val="22"/>
+        </w:rPr>
+        <w:t>Communication Diagram</w:t>
+      </w:r>
+    </w:p>
+    <w:p>
+      <w:pPr>
+        <w:numPr>
+          <w:ilvl w:val="0"/>
+          <w:numId w:val="4"/>
+        </w:numPr>
+        <w:rPr>
+          <w:rFonts w:ascii="Calibri" w:hAnsi="Calibri" w:cs="Calibri"/>
+          <w:sz w:val="22"/>
+          <w:szCs w:val="22"/>
+        </w:rPr>
+      </w:pPr>
+      <w:r>
+        <w:rPr>
+          <w:rFonts w:ascii="Calibri" w:hAnsi="Calibri" w:cs="Calibri"/>
+          <w:sz w:val="22"/>
+          <w:szCs w:val="22"/>
+        </w:rPr>
+        <w:t>Timing Diagram</w:t>
+      </w:r>
+    </w:p>
+    <w:p>
+      <w:pPr>
+        <w:rPr>
+          <w:rFonts w:ascii="Calibri" w:hAnsi="Calibri" w:cs="Calibri"/>
+        </w:rPr>
+      </w:pPr>
+      <w:r>
+        <w:rPr>
+          <w:rFonts w:ascii="Calibri" w:hAnsi="Calibri" w:cs="Calibri"/>
+        </w:rPr>
+        <w:t>Screenshots of each diagram are inserted below their respective descriptions.</w:t>
+      </w:r>
+    </w:p>
+    <w:p>
+      <w:pPr>
+        <w:pStyle w:val="Heading3"/>
+        <w:rPr>
+          <w:rFonts w:ascii="Calibri" w:hAnsi="Calibri" w:cs="Calibri"/>
+        </w:rPr>
+      </w:pPr>
+      <w:r>
+        <w:rPr>
+          <w:rFonts w:ascii="Calibri" w:hAnsi="Calibri" w:cs="Calibri"/>
+        </w:rPr>
+        <w:t>3.1 Use-Case Diagram</w:t>
+      </w:r>
+    </w:p>
+    <w:p>
+      <w:pPr>
+        <w:rPr>
+          <w:rFonts w:ascii="Calibri" w:hAnsi="Calibri" w:cs="Calibri"/>
+          <w:sz w:val="22"/>
+          <w:szCs w:val="22"/>
+        </w:rPr>
+      </w:pPr>
+      <w:r>
+        <w:rPr>
+          <w:rFonts w:ascii="Calibri" w:hAnsi="Calibri" w:cs="Calibri"/>
           <w:noProof/>
         </w:rPr>
         <w:drawing>
-          <wp:anchor distT="0" distB="0" distL="114300" distR="114300" simplePos="0" relativeHeight="251658240" behindDoc="0" locked="0" layoutInCell="1" allowOverlap="1" wp14:anchorId="19960F66" wp14:editId="5FE31E0E">
+          <wp:anchor distT="0" distB="0" distL="114300" distR="114300" simplePos="0" relativeHeight="251660288" behindDoc="0" locked="0" layoutInCell="1" allowOverlap="1" wp14:anchorId="26AE8DFD" wp14:editId="76046AF6">
             <wp:simplePos x="0" y="0"/>
             <wp:positionH relativeFrom="margin">
-              <wp:align>right</wp:align>
+              <wp:align>center</wp:align>
             </wp:positionH>
             <wp:positionV relativeFrom="paragraph">
-              <wp:posOffset>340360</wp:posOffset>
+              <wp:posOffset>890270</wp:posOffset>
             </wp:positionV>
-            <wp:extent cx="5731510" cy="4508500"/>
-            <wp:effectExtent l="0" t="0" r="2540" b="6350"/>
+            <wp:extent cx="5314950" cy="4180827"/>
+            <wp:effectExtent l="0" t="0" r="0" b="0"/>
             <wp:wrapTopAndBottom/>
-            <wp:docPr id="1607633359" name="Picture 1"/>
+            <wp:docPr id="541392037" name="Picture 1"/>
             <wp:cNvGraphicFramePr>
               <a:graphicFrameLocks xmlns:a="http://schemas.openxmlformats.org/drawingml/2006/main" noChangeAspect="1"/>
             </wp:cNvGraphicFramePr>
@@ -999,11 +1022,11 @@
               <a:graphicData uri="http://schemas.openxmlformats.org/drawingml/2006/picture">
                 <pic:pic xmlns:pic="http://schemas.openxmlformats.org/drawingml/2006/picture">
                   <pic:nvPicPr>
-                    <pic:cNvPr id="1607633359" name="Picture 1607633359"/>
+                    <pic:cNvPr id="541392037" name="Picture 541392037"/>
                     <pic:cNvPicPr/>
                   </pic:nvPicPr>
                   <pic:blipFill>
-                    <a:blip r:embed="rId7">
+                    <a:blip r:embed="rId8">
                       <a:extLst>
                         <a:ext uri="{28A0092B-C50C-407E-A947-70E740481C1C}">
                           <a14:useLocalDpi xmlns:a14="http://schemas.microsoft.com/office/drawing/2010/main" val="0"/>
@@ -1017,7 +1040,7 @@
                   <pic:spPr>
                     <a:xfrm>
                       <a:off x="0" y="0"/>
-                      <a:ext cx="5731510" cy="4508500"/>
+                      <a:ext cx="5314950" cy="4180827"/>
                     </a:xfrm>
                     <a:prstGeom prst="rect">
                       <a:avLst/>
@@ -1026,25 +1049,573 @@
                 </pic:pic>
               </a:graphicData>
             </a:graphic>
-            <wp14:sizeRelH relativeFrom="margin">
-              <wp14:pctWidth>0</wp14:pctWidth>
-            </wp14:sizeRelH>
-            <wp14:sizeRelV relativeFrom="margin">
-              <wp14:pctHeight>0</wp14:pctHeight>
-            </wp14:sizeRelV>
           </wp:anchor>
         </w:drawing>
       </w:r>
+      <w:r>
+        <w:rPr>
+          <w:rFonts w:ascii="Calibri" w:hAnsi="Calibri" w:cs="Calibri"/>
+          <w:sz w:val="22"/>
+          <w:szCs w:val="22"/>
+        </w:rPr>
+        <w:t>The Use-Case Diagram describes the external interactions between the system and its users. It identifies the main actors of the system—</w:t>
+      </w:r>
+      <w:r>
+        <w:rPr>
+          <w:rFonts w:ascii="Calibri" w:hAnsi="Calibri" w:cs="Calibri"/>
+          <w:b/>
+          <w:bCs/>
+          <w:sz w:val="22"/>
+          <w:szCs w:val="22"/>
+        </w:rPr>
+        <w:t>Patient</w:t>
+      </w:r>
+      <w:r>
+        <w:rPr>
+          <w:rFonts w:ascii="Calibri" w:hAnsi="Calibri" w:cs="Calibri"/>
+          <w:sz w:val="22"/>
+          <w:szCs w:val="22"/>
+        </w:rPr>
+        <w:t xml:space="preserve">, </w:t>
+      </w:r>
+      <w:r>
+        <w:rPr>
+          <w:rFonts w:ascii="Calibri" w:hAnsi="Calibri" w:cs="Calibri"/>
+          <w:b/>
+          <w:bCs/>
+          <w:sz w:val="22"/>
+          <w:szCs w:val="22"/>
+        </w:rPr>
+        <w:t>Doctor</w:t>
+      </w:r>
+      <w:r>
+        <w:rPr>
+          <w:rFonts w:ascii="Calibri" w:hAnsi="Calibri" w:cs="Calibri"/>
+          <w:sz w:val="22"/>
+          <w:szCs w:val="22"/>
+        </w:rPr>
+        <w:t xml:space="preserve">, and </w:t>
+      </w:r>
+      <w:r>
+        <w:rPr>
+          <w:rFonts w:ascii="Calibri" w:hAnsi="Calibri" w:cs="Calibri"/>
+          <w:b/>
+          <w:bCs/>
+          <w:sz w:val="22"/>
+          <w:szCs w:val="22"/>
+        </w:rPr>
+        <w:t>Admin</w:t>
+      </w:r>
+      <w:r>
+        <w:rPr>
+          <w:rFonts w:ascii="Calibri" w:hAnsi="Calibri" w:cs="Calibri"/>
+          <w:sz w:val="22"/>
+          <w:szCs w:val="22"/>
+        </w:rPr>
+        <w:t>—and the actions they can perform.</w:t>
+      </w:r>
+    </w:p>
+    <w:p>
+      <w:pPr>
+        <w:rPr>
+          <w:rFonts w:ascii="Calibri" w:hAnsi="Calibri" w:cs="Calibri"/>
+          <w:sz w:val="22"/>
+          <w:szCs w:val="22"/>
+        </w:rPr>
+      </w:pPr>
+      <w:r>
+        <w:rPr>
+          <w:rFonts w:ascii="Calibri" w:hAnsi="Calibri" w:cs="Calibri"/>
+          <w:sz w:val="22"/>
+          <w:szCs w:val="22"/>
+        </w:rPr>
+        <w:t>This diagram helps outline the functional requirements of the system and shows how users interact with the system to complete tasks such as booking appointments, managing doctor profiles, and viewing schedules.</w:t>
+      </w:r>
+    </w:p>
+    <w:p>
+      <w:pPr>
+        <w:pStyle w:val="Heading3"/>
+        <w:rPr>
+          <w:rFonts w:ascii="Calibri" w:hAnsi="Calibri" w:cs="Calibri"/>
+        </w:rPr>
+      </w:pPr>
+      <w:r>
+        <w:rPr>
+          <w:rFonts w:ascii="Calibri" w:hAnsi="Calibri" w:cs="Calibri"/>
+        </w:rPr>
+        <w:lastRenderedPageBreak/>
+        <w:t>3.2 Object Diagram</w:t>
+      </w:r>
+    </w:p>
+    <w:p>
+      <w:pPr>
+        <w:rPr>
+          <w:rFonts w:ascii="Calibri" w:hAnsi="Calibri" w:cs="Calibri"/>
+          <w:sz w:val="22"/>
+          <w:szCs w:val="22"/>
+        </w:rPr>
+      </w:pPr>
+      <w:r>
+        <w:rPr>
+          <w:rFonts w:ascii="Calibri" w:hAnsi="Calibri" w:cs="Calibri"/>
+          <w:sz w:val="22"/>
+          <w:szCs w:val="22"/>
+        </w:rPr>
+        <w:t xml:space="preserve">The Object Diagram shows a snapshot of the system at a specific moment in time. It presents actual instances of classes—such as </w:t>
+      </w:r>
+      <w:r>
+        <w:rPr>
+          <w:rFonts w:ascii="Calibri" w:hAnsi="Calibri" w:cs="Calibri"/>
+          <w:b/>
+          <w:bCs/>
+          <w:sz w:val="22"/>
+          <w:szCs w:val="22"/>
+        </w:rPr>
+        <w:t>User (Patient)</w:t>
+      </w:r>
+      <w:r>
+        <w:rPr>
+          <w:rFonts w:ascii="Calibri" w:hAnsi="Calibri" w:cs="Calibri"/>
+          <w:sz w:val="22"/>
+          <w:szCs w:val="22"/>
+        </w:rPr>
+        <w:t xml:space="preserve">, </w:t>
+      </w:r>
+      <w:r>
+        <w:rPr>
+          <w:rFonts w:ascii="Calibri" w:hAnsi="Calibri" w:cs="Calibri"/>
+          <w:b/>
+          <w:bCs/>
+          <w:sz w:val="22"/>
+          <w:szCs w:val="22"/>
+        </w:rPr>
+        <w:t>Doctor</w:t>
+      </w:r>
+      <w:r>
+        <w:rPr>
+          <w:rFonts w:ascii="Calibri" w:hAnsi="Calibri" w:cs="Calibri"/>
+          <w:sz w:val="22"/>
+          <w:szCs w:val="22"/>
+        </w:rPr>
+        <w:t xml:space="preserve">, </w:t>
+      </w:r>
+      <w:r>
+        <w:rPr>
+          <w:rFonts w:ascii="Calibri" w:hAnsi="Calibri" w:cs="Calibri"/>
+          <w:b/>
+          <w:bCs/>
+          <w:sz w:val="22"/>
+          <w:szCs w:val="22"/>
+        </w:rPr>
+        <w:t>Admin</w:t>
+      </w:r>
+      <w:r>
+        <w:rPr>
+          <w:rFonts w:ascii="Calibri" w:hAnsi="Calibri" w:cs="Calibri"/>
+          <w:sz w:val="22"/>
+          <w:szCs w:val="22"/>
+        </w:rPr>
+        <w:t xml:space="preserve">, and </w:t>
+      </w:r>
+      <w:r>
+        <w:rPr>
+          <w:rFonts w:ascii="Calibri" w:hAnsi="Calibri" w:cs="Calibri"/>
+          <w:b/>
+          <w:bCs/>
+          <w:sz w:val="22"/>
+          <w:szCs w:val="22"/>
+        </w:rPr>
+        <w:t>Appointment (</w:t>
+      </w:r>
       <w:proofErr w:type="spellStart"/>
-      <w:r>
-        <w:t>UseCase</w:t>
+      <w:proofErr w:type="gramStart"/>
+      <w:r>
+        <w:rPr>
+          <w:rFonts w:ascii="Calibri" w:hAnsi="Calibri" w:cs="Calibri"/>
+          <w:b/>
+          <w:bCs/>
+          <w:sz w:val="22"/>
+          <w:szCs w:val="22"/>
+        </w:rPr>
+        <w:t>Oppointment</w:t>
       </w:r>
       <w:proofErr w:type="spellEnd"/>
       <w:r>
-        <w:t xml:space="preserve"> Diagram</w:t>
-      </w:r>
-    </w:p>
-    <w:p/>
+        <w:rPr>
+          <w:rFonts w:ascii="Calibri" w:hAnsi="Calibri" w:cs="Calibri"/>
+          <w:b/>
+          <w:bCs/>
+          <w:sz w:val="22"/>
+          <w:szCs w:val="22"/>
+        </w:rPr>
+        <w:t>)</w:t>
+      </w:r>
+      <w:r>
+        <w:rPr>
+          <w:rFonts w:ascii="Calibri" w:hAnsi="Calibri" w:cs="Calibri"/>
+          <w:sz w:val="22"/>
+          <w:szCs w:val="22"/>
+        </w:rPr>
+        <w:t>—</w:t>
+      </w:r>
+      <w:proofErr w:type="gramEnd"/>
+      <w:r>
+        <w:rPr>
+          <w:rFonts w:ascii="Calibri" w:hAnsi="Calibri" w:cs="Calibri"/>
+          <w:sz w:val="22"/>
+          <w:szCs w:val="22"/>
+        </w:rPr>
+        <w:t>and displays how these objects are linked to each other.</w:t>
+      </w:r>
+    </w:p>
+    <w:p>
+      <w:pPr>
+        <w:rPr>
+          <w:rFonts w:ascii="Calibri" w:hAnsi="Calibri" w:cs="Calibri"/>
+          <w:sz w:val="22"/>
+          <w:szCs w:val="22"/>
+        </w:rPr>
+      </w:pPr>
+      <w:r>
+        <w:rPr>
+          <w:rFonts w:ascii="Calibri" w:hAnsi="Calibri" w:cs="Calibri"/>
+          <w:noProof/>
+        </w:rPr>
+        <w:drawing>
+          <wp:anchor distT="0" distB="0" distL="114300" distR="114300" simplePos="0" relativeHeight="251661312" behindDoc="0" locked="0" layoutInCell="1" allowOverlap="1" wp14:anchorId="2AF4650A" wp14:editId="2B7AC117">
+            <wp:simplePos x="0" y="0"/>
+            <wp:positionH relativeFrom="margin">
+              <wp:align>right</wp:align>
+            </wp:positionH>
+            <wp:positionV relativeFrom="paragraph">
+              <wp:posOffset>671830</wp:posOffset>
+            </wp:positionV>
+            <wp:extent cx="5731510" cy="3695065"/>
+            <wp:effectExtent l="0" t="0" r="2540" b="635"/>
+            <wp:wrapTopAndBottom/>
+            <wp:docPr id="1066996849" name="Picture 2"/>
+            <wp:cNvGraphicFramePr>
+              <a:graphicFrameLocks xmlns:a="http://schemas.openxmlformats.org/drawingml/2006/main" noChangeAspect="1"/>
+            </wp:cNvGraphicFramePr>
+            <a:graphic xmlns:a="http://schemas.openxmlformats.org/drawingml/2006/main">
+              <a:graphicData uri="http://schemas.openxmlformats.org/drawingml/2006/picture">
+                <pic:pic xmlns:pic="http://schemas.openxmlformats.org/drawingml/2006/picture">
+                  <pic:nvPicPr>
+                    <pic:cNvPr id="1066996849" name="Picture 1066996849"/>
+                    <pic:cNvPicPr/>
+                  </pic:nvPicPr>
+                  <pic:blipFill>
+                    <a:blip r:embed="rId9">
+                      <a:extLst>
+                        <a:ext uri="{28A0092B-C50C-407E-A947-70E740481C1C}">
+                          <a14:useLocalDpi xmlns:a14="http://schemas.microsoft.com/office/drawing/2010/main" val="0"/>
+                        </a:ext>
+                      </a:extLst>
+                    </a:blip>
+                    <a:stretch>
+                      <a:fillRect/>
+                    </a:stretch>
+                  </pic:blipFill>
+                  <pic:spPr>
+                    <a:xfrm>
+                      <a:off x="0" y="0"/>
+                      <a:ext cx="5731510" cy="3695065"/>
+                    </a:xfrm>
+                    <a:prstGeom prst="rect">
+                      <a:avLst/>
+                    </a:prstGeom>
+                  </pic:spPr>
+                </pic:pic>
+              </a:graphicData>
+            </a:graphic>
+          </wp:anchor>
+        </w:drawing>
+      </w:r>
+      <w:r>
+        <w:rPr>
+          <w:rFonts w:ascii="Calibri" w:hAnsi="Calibri" w:cs="Calibri"/>
+          <w:sz w:val="22"/>
+          <w:szCs w:val="22"/>
+        </w:rPr>
+        <w:t>This diagram helps visualize how data is stored and connected during the appointment booking process. It also confirms that the relationships defined in the class diagram work correctly at runtime.</w:t>
+      </w:r>
+    </w:p>
+    <w:p>
+      <w:pPr>
+        <w:rPr>
+          <w:rFonts w:ascii="Calibri" w:hAnsi="Calibri" w:cs="Calibri"/>
+        </w:rPr>
+      </w:pPr>
+    </w:p>
+    <w:p>
+      <w:pPr>
+        <w:pStyle w:val="Heading3"/>
+        <w:rPr>
+          <w:rFonts w:ascii="Calibri" w:hAnsi="Calibri" w:cs="Calibri"/>
+        </w:rPr>
+      </w:pPr>
+      <w:r>
+        <w:rPr>
+          <w:rFonts w:ascii="Calibri" w:hAnsi="Calibri" w:cs="Calibri"/>
+        </w:rPr>
+        <w:t>3.3 Communication Diagram</w:t>
+      </w:r>
+    </w:p>
+    <w:p>
+      <w:pPr>
+        <w:rPr>
+          <w:rFonts w:ascii="Calibri" w:hAnsi="Calibri" w:cs="Calibri"/>
+          <w:sz w:val="22"/>
+          <w:szCs w:val="22"/>
+        </w:rPr>
+      </w:pPr>
+      <w:r>
+        <w:rPr>
+          <w:rFonts w:ascii="Calibri" w:hAnsi="Calibri" w:cs="Calibri"/>
+          <w:sz w:val="22"/>
+          <w:szCs w:val="22"/>
+        </w:rPr>
+        <w:t xml:space="preserve">The Communication Diagram illustrates the message flow and interactions between objects during the appointment booking process. It shows how the </w:t>
+      </w:r>
+      <w:r>
+        <w:rPr>
+          <w:rFonts w:ascii="Calibri" w:hAnsi="Calibri" w:cs="Calibri"/>
+          <w:b/>
+          <w:bCs/>
+          <w:sz w:val="22"/>
+          <w:szCs w:val="22"/>
+        </w:rPr>
+        <w:t>Patient</w:t>
+      </w:r>
+      <w:r>
+        <w:rPr>
+          <w:rFonts w:ascii="Calibri" w:hAnsi="Calibri" w:cs="Calibri"/>
+          <w:sz w:val="22"/>
+          <w:szCs w:val="22"/>
+        </w:rPr>
+        <w:t xml:space="preserve">, </w:t>
+      </w:r>
+      <w:r>
+        <w:rPr>
+          <w:rFonts w:ascii="Calibri" w:hAnsi="Calibri" w:cs="Calibri"/>
+          <w:b/>
+          <w:bCs/>
+          <w:sz w:val="22"/>
+          <w:szCs w:val="22"/>
+        </w:rPr>
+        <w:t>Doctor</w:t>
+      </w:r>
+      <w:r>
+        <w:rPr>
+          <w:rFonts w:ascii="Calibri" w:hAnsi="Calibri" w:cs="Calibri"/>
+          <w:sz w:val="22"/>
+          <w:szCs w:val="22"/>
+        </w:rPr>
+        <w:t xml:space="preserve">, and </w:t>
+      </w:r>
+      <w:r>
+        <w:rPr>
+          <w:rFonts w:ascii="Calibri" w:hAnsi="Calibri" w:cs="Calibri"/>
+          <w:b/>
+          <w:bCs/>
+          <w:sz w:val="22"/>
+          <w:szCs w:val="22"/>
+        </w:rPr>
+        <w:t>Appointment</w:t>
+      </w:r>
+      <w:r>
+        <w:rPr>
+          <w:rFonts w:ascii="Calibri" w:hAnsi="Calibri" w:cs="Calibri"/>
+          <w:sz w:val="22"/>
+          <w:szCs w:val="22"/>
+        </w:rPr>
+        <w:t xml:space="preserve"> objects communicate and exchange messages </w:t>
+      </w:r>
+      <w:proofErr w:type="gramStart"/>
+      <w:r>
+        <w:rPr>
+          <w:rFonts w:ascii="Calibri" w:hAnsi="Calibri" w:cs="Calibri"/>
+          <w:sz w:val="22"/>
+          <w:szCs w:val="22"/>
+        </w:rPr>
+        <w:t>in order to</w:t>
+      </w:r>
+      <w:proofErr w:type="gramEnd"/>
+      <w:r>
+        <w:rPr>
+          <w:rFonts w:ascii="Calibri" w:hAnsi="Calibri" w:cs="Calibri"/>
+          <w:sz w:val="22"/>
+          <w:szCs w:val="22"/>
+        </w:rPr>
+        <w:t xml:space="preserve"> complete the booking.</w:t>
+      </w:r>
+    </w:p>
+    <w:p>
+      <w:pPr>
+        <w:rPr>
+          <w:rFonts w:ascii="Calibri" w:hAnsi="Calibri" w:cs="Calibri"/>
+          <w:sz w:val="22"/>
+          <w:szCs w:val="22"/>
+        </w:rPr>
+      </w:pPr>
+      <w:r>
+        <w:rPr>
+          <w:rFonts w:ascii="Calibri" w:hAnsi="Calibri" w:cs="Calibri"/>
+          <w:sz w:val="22"/>
+          <w:szCs w:val="22"/>
+        </w:rPr>
+        <w:t>This diagram focuses on the structure of the interaction and the order in which messages are passed, helping to better understand system behavior during runtime.</w:t>
+      </w:r>
+    </w:p>
+    <w:p>
+      <w:pPr>
+        <w:rPr>
+          <w:rFonts w:ascii="Calibri" w:hAnsi="Calibri" w:cs="Calibri"/>
+        </w:rPr>
+      </w:pPr>
+      <w:r>
+        <w:rPr>
+          <w:rFonts w:ascii="Calibri" w:hAnsi="Calibri" w:cs="Calibri"/>
+          <w:noProof/>
+        </w:rPr>
+        <w:lastRenderedPageBreak/>
+        <w:drawing>
+          <wp:anchor distT="0" distB="0" distL="114300" distR="114300" simplePos="0" relativeHeight="251662336" behindDoc="0" locked="0" layoutInCell="1" allowOverlap="1" wp14:anchorId="2788E867" wp14:editId="1DBD0855">
+            <wp:simplePos x="0" y="0"/>
+            <wp:positionH relativeFrom="margin">
+              <wp:align>right</wp:align>
+            </wp:positionH>
+            <wp:positionV relativeFrom="paragraph">
+              <wp:posOffset>0</wp:posOffset>
+            </wp:positionV>
+            <wp:extent cx="5731510" cy="2862580"/>
+            <wp:effectExtent l="0" t="0" r="2540" b="0"/>
+            <wp:wrapTopAndBottom/>
+            <wp:docPr id="377853375" name="Picture 3"/>
+            <wp:cNvGraphicFramePr>
+              <a:graphicFrameLocks xmlns:a="http://schemas.openxmlformats.org/drawingml/2006/main" noChangeAspect="1"/>
+            </wp:cNvGraphicFramePr>
+            <a:graphic xmlns:a="http://schemas.openxmlformats.org/drawingml/2006/main">
+              <a:graphicData uri="http://schemas.openxmlformats.org/drawingml/2006/picture">
+                <pic:pic xmlns:pic="http://schemas.openxmlformats.org/drawingml/2006/picture">
+                  <pic:nvPicPr>
+                    <pic:cNvPr id="377853375" name="Picture 377853375"/>
+                    <pic:cNvPicPr/>
+                  </pic:nvPicPr>
+                  <pic:blipFill>
+                    <a:blip r:embed="rId10">
+                      <a:extLst>
+                        <a:ext uri="{28A0092B-C50C-407E-A947-70E740481C1C}">
+                          <a14:useLocalDpi xmlns:a14="http://schemas.microsoft.com/office/drawing/2010/main" val="0"/>
+                        </a:ext>
+                      </a:extLst>
+                    </a:blip>
+                    <a:stretch>
+                      <a:fillRect/>
+                    </a:stretch>
+                  </pic:blipFill>
+                  <pic:spPr>
+                    <a:xfrm>
+                      <a:off x="0" y="0"/>
+                      <a:ext cx="5731510" cy="2862580"/>
+                    </a:xfrm>
+                    <a:prstGeom prst="rect">
+                      <a:avLst/>
+                    </a:prstGeom>
+                  </pic:spPr>
+                </pic:pic>
+              </a:graphicData>
+            </a:graphic>
+          </wp:anchor>
+        </w:drawing>
+      </w:r>
+    </w:p>
+    <w:p>
+      <w:pPr>
+        <w:pStyle w:val="Heading3"/>
+        <w:rPr>
+          <w:rFonts w:ascii="Calibri" w:hAnsi="Calibri" w:cs="Calibri"/>
+        </w:rPr>
+      </w:pPr>
+      <w:r>
+        <w:rPr>
+          <w:rFonts w:ascii="Calibri" w:hAnsi="Calibri" w:cs="Calibri"/>
+        </w:rPr>
+        <w:t>3.4 Timing Diagram</w:t>
+      </w:r>
+    </w:p>
+    <w:p>
+      <w:pPr>
+        <w:rPr>
+          <w:rFonts w:ascii="Calibri" w:hAnsi="Calibri" w:cs="Calibri"/>
+          <w:sz w:val="22"/>
+          <w:szCs w:val="22"/>
+        </w:rPr>
+      </w:pPr>
+      <w:r>
+        <w:rPr>
+          <w:rFonts w:ascii="Calibri" w:hAnsi="Calibri" w:cs="Calibri"/>
+          <w:noProof/>
+        </w:rPr>
+        <w:drawing>
+          <wp:anchor distT="0" distB="0" distL="114300" distR="114300" simplePos="0" relativeHeight="251663360" behindDoc="0" locked="0" layoutInCell="1" allowOverlap="1" wp14:anchorId="58B0C05A" wp14:editId="5C69E464">
+            <wp:simplePos x="0" y="0"/>
+            <wp:positionH relativeFrom="margin">
+              <wp:align>right</wp:align>
+            </wp:positionH>
+            <wp:positionV relativeFrom="paragraph">
+              <wp:posOffset>939800</wp:posOffset>
+            </wp:positionV>
+            <wp:extent cx="5731510" cy="4434205"/>
+            <wp:effectExtent l="0" t="0" r="2540" b="4445"/>
+            <wp:wrapTopAndBottom/>
+            <wp:docPr id="767938265" name="Picture 4"/>
+            <wp:cNvGraphicFramePr>
+              <a:graphicFrameLocks xmlns:a="http://schemas.openxmlformats.org/drawingml/2006/main" noChangeAspect="1"/>
+            </wp:cNvGraphicFramePr>
+            <a:graphic xmlns:a="http://schemas.openxmlformats.org/drawingml/2006/main">
+              <a:graphicData uri="http://schemas.openxmlformats.org/drawingml/2006/picture">
+                <pic:pic xmlns:pic="http://schemas.openxmlformats.org/drawingml/2006/picture">
+                  <pic:nvPicPr>
+                    <pic:cNvPr id="767938265" name="Picture 767938265"/>
+                    <pic:cNvPicPr/>
+                  </pic:nvPicPr>
+                  <pic:blipFill>
+                    <a:blip r:embed="rId11">
+                      <a:extLst>
+                        <a:ext uri="{28A0092B-C50C-407E-A947-70E740481C1C}">
+                          <a14:useLocalDpi xmlns:a14="http://schemas.microsoft.com/office/drawing/2010/main" val="0"/>
+                        </a:ext>
+                      </a:extLst>
+                    </a:blip>
+                    <a:stretch>
+                      <a:fillRect/>
+                    </a:stretch>
+                  </pic:blipFill>
+                  <pic:spPr>
+                    <a:xfrm>
+                      <a:off x="0" y="0"/>
+                      <a:ext cx="5731510" cy="4434205"/>
+                    </a:xfrm>
+                    <a:prstGeom prst="rect">
+                      <a:avLst/>
+                    </a:prstGeom>
+                  </pic:spPr>
+                </pic:pic>
+              </a:graphicData>
+            </a:graphic>
+          </wp:anchor>
+        </w:drawing>
+      </w:r>
+      <w:r>
+        <w:rPr>
+          <w:rFonts w:ascii="Calibri" w:hAnsi="Calibri" w:cs="Calibri"/>
+          <w:sz w:val="22"/>
+          <w:szCs w:val="22"/>
+        </w:rPr>
+        <w:t>The Timing Diagram explains how the states of different objects change over time during the appointment booking process. It shows the timeline of events from when the patient selects a doctor to when the appointment is confirmed.</w:t>
+      </w:r>
+    </w:p>
     <w:p>
       <w:pPr>
         <w:rPr>
@@ -1239,6 +1810,119 @@
     </w:lvl>
   </w:abstractNum>
   <w:abstractNum w:abstractNumId="2" w15:restartNumberingAfterBreak="0">
+    <w:nsid w:val="63CA00C3"/>
+    <w:multiLevelType w:val="multilevel"/>
+    <w:tmpl w:val="D6DC7410"/>
+    <w:lvl w:ilvl="0">
+      <w:start w:val="1"/>
+      <w:numFmt w:val="decimal"/>
+      <w:lvlText w:val="%1."/>
+      <w:lvlJc w:val="left"/>
+      <w:pPr>
+        <w:tabs>
+          <w:tab w:val="num" w:pos="720"/>
+        </w:tabs>
+        <w:ind w:left="720" w:hanging="360"/>
+      </w:pPr>
+    </w:lvl>
+    <w:lvl w:ilvl="1" w:tentative="1">
+      <w:start w:val="1"/>
+      <w:numFmt w:val="decimal"/>
+      <w:lvlText w:val="%2."/>
+      <w:lvlJc w:val="left"/>
+      <w:pPr>
+        <w:tabs>
+          <w:tab w:val="num" w:pos="1440"/>
+        </w:tabs>
+        <w:ind w:left="1440" w:hanging="360"/>
+      </w:pPr>
+    </w:lvl>
+    <w:lvl w:ilvl="2" w:tentative="1">
+      <w:start w:val="1"/>
+      <w:numFmt w:val="decimal"/>
+      <w:lvlText w:val="%3."/>
+      <w:lvlJc w:val="left"/>
+      <w:pPr>
+        <w:tabs>
+          <w:tab w:val="num" w:pos="2160"/>
+        </w:tabs>
+        <w:ind w:left="2160" w:hanging="360"/>
+      </w:pPr>
+    </w:lvl>
+    <w:lvl w:ilvl="3" w:tentative="1">
+      <w:start w:val="1"/>
+      <w:numFmt w:val="decimal"/>
+      <w:lvlText w:val="%4."/>
+      <w:lvlJc w:val="left"/>
+      <w:pPr>
+        <w:tabs>
+          <w:tab w:val="num" w:pos="2880"/>
+        </w:tabs>
+        <w:ind w:left="2880" w:hanging="360"/>
+      </w:pPr>
+    </w:lvl>
+    <w:lvl w:ilvl="4" w:tentative="1">
+      <w:start w:val="1"/>
+      <w:numFmt w:val="decimal"/>
+      <w:lvlText w:val="%5."/>
+      <w:lvlJc w:val="left"/>
+      <w:pPr>
+        <w:tabs>
+          <w:tab w:val="num" w:pos="3600"/>
+        </w:tabs>
+        <w:ind w:left="3600" w:hanging="360"/>
+      </w:pPr>
+    </w:lvl>
+    <w:lvl w:ilvl="5" w:tentative="1">
+      <w:start w:val="1"/>
+      <w:numFmt w:val="decimal"/>
+      <w:lvlText w:val="%6."/>
+      <w:lvlJc w:val="left"/>
+      <w:pPr>
+        <w:tabs>
+          <w:tab w:val="num" w:pos="4320"/>
+        </w:tabs>
+        <w:ind w:left="4320" w:hanging="360"/>
+      </w:pPr>
+    </w:lvl>
+    <w:lvl w:ilvl="6" w:tentative="1">
+      <w:start w:val="1"/>
+      <w:numFmt w:val="decimal"/>
+      <w:lvlText w:val="%7."/>
+      <w:lvlJc w:val="left"/>
+      <w:pPr>
+        <w:tabs>
+          <w:tab w:val="num" w:pos="5040"/>
+        </w:tabs>
+        <w:ind w:left="5040" w:hanging="360"/>
+      </w:pPr>
+    </w:lvl>
+    <w:lvl w:ilvl="7" w:tentative="1">
+      <w:start w:val="1"/>
+      <w:numFmt w:val="decimal"/>
+      <w:lvlText w:val="%8."/>
+      <w:lvlJc w:val="left"/>
+      <w:pPr>
+        <w:tabs>
+          <w:tab w:val="num" w:pos="5760"/>
+        </w:tabs>
+        <w:ind w:left="5760" w:hanging="360"/>
+      </w:pPr>
+    </w:lvl>
+    <w:lvl w:ilvl="8" w:tentative="1">
+      <w:start w:val="1"/>
+      <w:numFmt w:val="decimal"/>
+      <w:lvlText w:val="%9."/>
+      <w:lvlJc w:val="left"/>
+      <w:pPr>
+        <w:tabs>
+          <w:tab w:val="num" w:pos="6480"/>
+        </w:tabs>
+        <w:ind w:left="6480" w:hanging="360"/>
+      </w:pPr>
+    </w:lvl>
+  </w:abstractNum>
+  <w:abstractNum w:abstractNumId="3" w15:restartNumberingAfterBreak="0">
     <w:nsid w:val="7E93346B"/>
     <w:multiLevelType w:val="hybridMultilevel"/>
     <w:tmpl w:val="50485BA4"/>
@@ -1331,6 +2015,9 @@
     <w:abstractNumId w:val="0"/>
   </w:num>
   <w:num w:numId="3" w16cid:durableId="674382945">
+    <w:abstractNumId w:val="3"/>
+  </w:num>
+  <w:num w:numId="4" w16cid:durableId="1982929353">
     <w:abstractNumId w:val="2"/>
   </w:num>
 </w:numbering>
@@ -2565,4 +3252,16 @@
     </a:ext>
   </a:extLst>
 </a:theme>
+</file>
+
+<file path=customXml/item1.xml><?xml version="1.0" encoding="utf-8"?>
+<b:Sources xmlns:b="http://schemas.openxmlformats.org/officeDocument/2006/bibliography" xmlns="http://schemas.openxmlformats.org/officeDocument/2006/bibliography" SelectedStyle="\APASixthEditionOfficeOnline.xsl" StyleName="APA" Version="6"/>
+</file>
+
+<file path=customXml/itemProps1.xml><?xml version="1.0" encoding="utf-8"?>
+<ds:datastoreItem xmlns:ds="http://schemas.openxmlformats.org/officeDocument/2006/customXml" ds:itemID="{97EC2419-1B32-4E24-9289-9274498C0989}">
+  <ds:schemaRefs>
+    <ds:schemaRef ds:uri="http://schemas.openxmlformats.org/officeDocument/2006/bibliography"/>
+  </ds:schemaRefs>
+</ds:datastoreItem>
 </file>
</xml_diff>